<commit_message>
fix(docs): re-render architecture diagram to horizontal layout to fit page without clipping
</commit_message>
<xml_diff>
--- a/docs/05-Báo cáo bài tập lớn DevSecOps.docx
+++ b/docs/05-Báo cáo bài tập lớn DevSecOps.docx
@@ -8634,13 +8634,14 @@
     </w:p>
     <w:p>
       <w:pPr>
-        <w:spacing w:before="160" w:after="80"/>
+        <w:keepNext/>
+        <w:spacing w:before="160" w:after="60"/>
         <w:jc w:val="center"/>
       </w:pPr>
       <w:r>
         <w:drawing>
           <wp:inline xmlns:a="http://schemas.openxmlformats.org/drawingml/2006/main" xmlns:pic="http://schemas.openxmlformats.org/drawingml/2006/picture">
-            <wp:extent cx="5669280" cy="17788812"/>
+            <wp:extent cx="5669280" cy="1366701"/>
             <wp:docPr id="68" name="Picture 68"/>
             <wp:cNvGraphicFramePr>
               <a:graphicFrameLocks noChangeAspect="1"/>
@@ -8661,7 +8662,7 @@
                   <pic:spPr>
                     <a:xfrm>
                       <a:off x="0" y="0"/>
-                      <a:ext cx="5669280" cy="17788812"/>
+                      <a:ext cx="5669280" cy="1366701"/>
                     </a:xfrm>
                     <a:prstGeom prst="rect"/>
                   </pic:spPr>
@@ -8675,7 +8676,7 @@
     <w:p>
       <w:pPr>
         <w:pStyle w:val="CTDT-Hinh"/>
-        <w:spacing w:before="80" w:after="120"/>
+        <w:spacing w:before="60" w:after="160"/>
         <w:jc w:val="center"/>
         <w:numPr>
           <w:numId w:val="0"/>
@@ -8975,13 +8976,14 @@
     </w:p>
     <w:p>
       <w:pPr>
-        <w:spacing w:before="160" w:after="80"/>
+        <w:keepNext/>
+        <w:spacing w:before="160" w:after="60"/>
         <w:jc w:val="center"/>
       </w:pPr>
       <w:r>
         <w:drawing>
           <wp:inline xmlns:a="http://schemas.openxmlformats.org/drawingml/2006/main" xmlns:pic="http://schemas.openxmlformats.org/drawingml/2006/picture">
-            <wp:extent cx="5303520" cy="2306761"/>
+            <wp:extent cx="5303520" cy="2306760"/>
             <wp:docPr id="69" name="Picture 69"/>
             <wp:cNvGraphicFramePr>
               <a:graphicFrameLocks noChangeAspect="1"/>
@@ -9002,7 +9004,7 @@
                   <pic:spPr>
                     <a:xfrm>
                       <a:off x="0" y="0"/>
-                      <a:ext cx="5303520" cy="2306761"/>
+                      <a:ext cx="5303520" cy="2306760"/>
                     </a:xfrm>
                     <a:prstGeom prst="rect"/>
                   </pic:spPr>
@@ -9016,7 +9018,7 @@
     <w:p>
       <w:pPr>
         <w:pStyle w:val="CTDT-Hinh"/>
-        <w:spacing w:before="80" w:after="120"/>
+        <w:spacing w:before="60" w:after="160"/>
         <w:jc w:val="center"/>
         <w:numPr>
           <w:numId w:val="0"/>
@@ -10320,13 +10322,14 @@
     </w:p>
     <w:p>
       <w:pPr>
-        <w:spacing w:before="160" w:after="80"/>
+        <w:keepNext/>
+        <w:spacing w:before="160" w:after="60"/>
         <w:jc w:val="center"/>
       </w:pPr>
       <w:r>
         <w:drawing>
           <wp:inline xmlns:a="http://schemas.openxmlformats.org/drawingml/2006/main" xmlns:pic="http://schemas.openxmlformats.org/drawingml/2006/picture">
-            <wp:extent cx="5303520" cy="6101754"/>
+            <wp:extent cx="5303520" cy="947057"/>
             <wp:docPr id="70" name="Picture 70"/>
             <wp:cNvGraphicFramePr>
               <a:graphicFrameLocks noChangeAspect="1"/>
@@ -10347,7 +10350,7 @@
                   <pic:spPr>
                     <a:xfrm>
                       <a:off x="0" y="0"/>
-                      <a:ext cx="5303520" cy="6101754"/>
+                      <a:ext cx="5303520" cy="947057"/>
                     </a:xfrm>
                     <a:prstGeom prst="rect"/>
                   </pic:spPr>
@@ -10361,7 +10364,7 @@
     <w:p>
       <w:pPr>
         <w:pStyle w:val="CTDT-Hinh"/>
-        <w:spacing w:before="80" w:after="120"/>
+        <w:spacing w:before="60" w:after="160"/>
         <w:jc w:val="center"/>
         <w:numPr>
           <w:numId w:val="0"/>
@@ -10497,7 +10500,8 @@
     </w:p>
     <w:p>
       <w:pPr>
-        <w:spacing w:before="160" w:after="80"/>
+        <w:keepNext/>
+        <w:spacing w:before="160" w:after="60"/>
         <w:jc w:val="center"/>
       </w:pPr>
       <w:r>
@@ -10538,7 +10542,7 @@
     <w:p>
       <w:pPr>
         <w:pStyle w:val="CTDT-Hinh"/>
-        <w:spacing w:before="80" w:after="120"/>
+        <w:spacing w:before="60" w:after="160"/>
         <w:jc w:val="center"/>
         <w:numPr>
           <w:numId w:val="0"/>
@@ -14012,13 +14016,14 @@
     </w:p>
     <w:p>
       <w:pPr>
-        <w:spacing w:before="160" w:after="80"/>
+        <w:keepNext/>
+        <w:spacing w:before="160" w:after="60"/>
         <w:jc w:val="center"/>
       </w:pPr>
       <w:r>
         <w:drawing>
           <wp:inline xmlns:a="http://schemas.openxmlformats.org/drawingml/2006/main" xmlns:pic="http://schemas.openxmlformats.org/drawingml/2006/picture">
-            <wp:extent cx="5486400" cy="8001000"/>
+            <wp:extent cx="5486400" cy="3624942"/>
             <wp:docPr id="72" name="Picture 72"/>
             <wp:cNvGraphicFramePr>
               <a:graphicFrameLocks noChangeAspect="1"/>
@@ -14039,7 +14044,7 @@
                   <pic:spPr>
                     <a:xfrm>
                       <a:off x="0" y="0"/>
-                      <a:ext cx="5486400" cy="8001000"/>
+                      <a:ext cx="5486400" cy="3624942"/>
                     </a:xfrm>
                     <a:prstGeom prst="rect"/>
                   </pic:spPr>
@@ -14053,7 +14058,7 @@
     <w:p>
       <w:pPr>
         <w:pStyle w:val="CTDT-Hinh"/>
-        <w:spacing w:before="80" w:after="120"/>
+        <w:spacing w:before="60" w:after="160"/>
         <w:jc w:val="center"/>
         <w:numPr>
           <w:numId w:val="0"/>
@@ -15802,13 +15807,14 @@
     </w:p>
     <w:p>
       <w:pPr>
-        <w:spacing w:before="160" w:after="80"/>
+        <w:keepNext/>
+        <w:spacing w:before="160" w:after="60"/>
         <w:jc w:val="center"/>
       </w:pPr>
       <w:r>
         <w:drawing>
           <wp:inline xmlns:a="http://schemas.openxmlformats.org/drawingml/2006/main" xmlns:pic="http://schemas.openxmlformats.org/drawingml/2006/picture">
-            <wp:extent cx="5669280" cy="5184788"/>
+            <wp:extent cx="4799260" cy="4389120"/>
             <wp:docPr id="73" name="Picture 73"/>
             <wp:cNvGraphicFramePr>
               <a:graphicFrameLocks noChangeAspect="1"/>
@@ -15829,7 +15835,7 @@
                   <pic:spPr>
                     <a:xfrm>
                       <a:off x="0" y="0"/>
-                      <a:ext cx="5669280" cy="5184788"/>
+                      <a:ext cx="4799260" cy="4389120"/>
                     </a:xfrm>
                     <a:prstGeom prst="rect"/>
                   </pic:spPr>
@@ -15843,7 +15849,7 @@
     <w:p>
       <w:pPr>
         <w:pStyle w:val="CTDT-Hinh"/>
-        <w:spacing w:before="80" w:after="120"/>
+        <w:spacing w:before="60" w:after="160"/>
         <w:jc w:val="center"/>
         <w:numPr>
           <w:numId w:val="0"/>
@@ -16725,18 +16731,62 @@
     </w:p>
     <w:p>
       <w:pPr>
-        <w:pStyle w:val="CTDT-Text"/>
-        <w:spacing w:line="288" w:lineRule="auto" w:before="0" w:after="50"/>
-        <w:jc w:val="both"/>
-      </w:pPr>
-      <w:r>
-        <w:rPr>
-          <w:rFonts w:ascii="Times New Roman" w:hAnsi="Times New Roman"/>
-          <w:b w:val="0"/>
-          <w:i w:val="0"/>
-          <w:sz w:val="26"/>
-        </w:rPr>
-        <w:t>![Hình 4.1: Kiến trúc thu thập nhật ký kép (Dual-Stream Logging) và chu trình phân tích an ninh tập trung.](diagram_dual_stream.png)</w:t>
+        <w:keepNext/>
+        <w:spacing w:before="160" w:after="60"/>
+        <w:jc w:val="center"/>
+      </w:pPr>
+      <w:r>
+        <w:drawing>
+          <wp:inline xmlns:a="http://schemas.openxmlformats.org/drawingml/2006/main" xmlns:pic="http://schemas.openxmlformats.org/drawingml/2006/picture">
+            <wp:extent cx="5303520" cy="3233523"/>
+            <wp:docPr id="74" name="Picture 74"/>
+            <wp:cNvGraphicFramePr>
+              <a:graphicFrameLocks noChangeAspect="1"/>
+            </wp:cNvGraphicFramePr>
+            <a:graphic>
+              <a:graphicData uri="http://schemas.openxmlformats.org/drawingml/2006/picture">
+                <pic:pic>
+                  <pic:nvPicPr>
+                    <pic:cNvPr id="0" name="diagram_dual_stream.png"/>
+                    <pic:cNvPicPr/>
+                  </pic:nvPicPr>
+                  <pic:blipFill>
+                    <a:blip r:embed="rId23"/>
+                    <a:stretch>
+                      <a:fillRect/>
+                    </a:stretch>
+                  </pic:blipFill>
+                  <pic:spPr>
+                    <a:xfrm>
+                      <a:off x="0" y="0"/>
+                      <a:ext cx="5303520" cy="3233523"/>
+                    </a:xfrm>
+                    <a:prstGeom prst="rect"/>
+                  </pic:spPr>
+                </pic:pic>
+              </a:graphicData>
+            </a:graphic>
+          </wp:inline>
+        </w:drawing>
+      </w:r>
+    </w:p>
+    <w:p>
+      <w:pPr>
+        <w:pStyle w:val="CTDT-Hinh"/>
+        <w:spacing w:before="60" w:after="160"/>
+        <w:jc w:val="center"/>
+        <w:numPr>
+          <w:numId w:val="0"/>
+        </w:numPr>
+      </w:pPr>
+      <w:r>
+        <w:rPr>
+          <w:rFonts w:ascii="Times New Roman" w:hAnsi="Times New Roman"/>
+          <w:b/>
+          <w:i/>
+          <w:sz w:val="24"/>
+        </w:rPr>
+        <w:t>Hình 4.1: Kiến trúc thu thập nhật ký kép (Dual-Stream Logging) và chu trình phân tích an ninh tập trung.</w:t>
       </w:r>
     </w:p>
     <w:p>

</xml_diff>